<commit_message>
documentos: biblioteca de modelos de Leandro (2026-10-27), servicio Demanda y datos del notario que llena el equipo
- templates/documents: la biblioteca nueva reemplaza a la vieja (166 modelos; los 4 .doc convertidos a .docx)
- scripts/importar-biblioteca.js: carga dentro del servidor (modo prueba por defecto, --aplicar), aprueba las
  etiquetas de Leandro tal cual, desactiva lo viejo y deja para revisar (con aviso) lo que no trae etiquetas
- migración 20261028: origen 'library' y el servicio Demanda (documentación motivada, por foja)
- bot: los datos del notario, el alguacil y la fecha y lugar de la firma no se le piden al cliente

Co-Authored-By: Claude Opus 5.5 <noreply@anthropic.com>
</commit_message>
<xml_diff>
--- a/templates/documents/CONTRATOS CIVILES/CONTRATOS AUTENTICOS/COMERCIALES/ACTO DE NOTORIEDAD DE EXISTENCIA DE ESTABLECIMIENTO COMERCIAL.docx
+++ b/templates/documents/CONTRATOS CIVILES/CONTRATOS AUTENTICOS/COMERCIALES/ACTO DE NOTORIEDAD DE EXISTENCIA DE ESTABLECIMIENTO COMERCIAL.docx
@@ -4,427 +4,584 @@
   <w:body>
     <w:p>
       <w:pPr>
+        <w:spacing w:after="0" w:line="240" w:lineRule="auto"/>
+        <w:jc w:val="center"/>
+        <w:rPr>
+          <w:sz w:val="22"/>
+          <w:szCs w:val="22"/>
+        </w:rPr>
+      </w:pPr>
+      <w:r>
+        <w:rPr>
+          <w:sz w:val="22"/>
+          <w:szCs w:val="22"/>
+        </w:rPr>
+        <w:t>ACTO NÚMERO {{NUMERO_ACTO_AUTENTICO}</w:t>
+      </w:r>
+      <w:proofErr w:type="gramStart"/>
+      <w:r>
+        <w:rPr>
+          <w:sz w:val="22"/>
+          <w:szCs w:val="22"/>
+        </w:rPr>
+        <w:t>}.-</w:t>
+      </w:r>
+      <w:proofErr w:type="gramEnd"/>
+      <w:r>
+        <w:rPr>
+          <w:sz w:val="22"/>
+          <w:szCs w:val="22"/>
+        </w:rPr>
+        <w:t xml:space="preserve"> (ACTO DE NOTORIEDAD DE EXISTENCIA DE ESTABLECIMIENTO COMERCIAL)</w:t>
+      </w:r>
+    </w:p>
+    <w:p>
+      <w:pPr>
+        <w:spacing w:after="0" w:line="240" w:lineRule="auto"/>
         <w:jc w:val="both"/>
-      </w:pPr>
-      <w:r>
-        <w:t xml:space="preserve">El </w:t>
-      </w:r>
-      <w:r>
-        <w:rPr>
-          <w:b/>
-          <w:bCs/>
-        </w:rPr>
-        <w:t>Acto de Notoriedad de Existencia de Negocio</w:t>
-      </w:r>
-      <w:r>
-        <w:t xml:space="preserve"> es un instrumento legal utilizado en la República Dominicana para certificar que un establecimiento comercial ha estado operando de manera pública y continua en una ubicación específica.</w:t>
-      </w:r>
-    </w:p>
-    <w:p>
-      <w:pPr>
+        <w:rPr>
+          <w:sz w:val="22"/>
+          <w:szCs w:val="22"/>
+        </w:rPr>
+      </w:pPr>
+    </w:p>
+    <w:p>
+      <w:pPr>
+        <w:spacing w:after="0" w:line="240" w:lineRule="auto"/>
         <w:jc w:val="both"/>
-      </w:pPr>
-      <w:r>
-        <w:t xml:space="preserve">Es frecuentemente solicitado para </w:t>
-      </w:r>
-      <w:r>
-        <w:rPr>
-          <w:b/>
-          <w:bCs/>
-        </w:rPr>
-        <w:t>procesos de adecuación en la DGII</w:t>
-      </w:r>
-      <w:r>
-        <w:t xml:space="preserve">, solicitudes de </w:t>
-      </w:r>
-      <w:r>
-        <w:rPr>
-          <w:b/>
-          <w:bCs/>
-        </w:rPr>
-        <w:t>registros sanitarios</w:t>
-      </w:r>
-      <w:r>
-        <w:t xml:space="preserve">, obtención de </w:t>
-      </w:r>
-      <w:r>
-        <w:rPr>
-          <w:b/>
-          <w:bCs/>
-        </w:rPr>
-        <w:t>permisos municipales</w:t>
-      </w:r>
-      <w:r>
-        <w:t xml:space="preserve"> o para formalizar contratos de servicios (energía eléctrica, agua) cuando no se dispone de un contrato de alquiler registrado. Se fundamenta en la </w:t>
-      </w:r>
-      <w:r>
-        <w:rPr>
-          <w:b/>
-          <w:bCs/>
-        </w:rPr>
-        <w:t>Ley No. 140-15 del Notariado</w:t>
-      </w:r>
-      <w:r>
-        <w:t>.</w:t>
-      </w:r>
-    </w:p>
-    <w:p>
-      <w:pPr>
+        <w:rPr>
+          <w:sz w:val="22"/>
+          <w:szCs w:val="22"/>
+        </w:rPr>
+      </w:pPr>
+      <w:r>
+        <w:rPr>
+          <w:sz w:val="22"/>
+          <w:szCs w:val="22"/>
+        </w:rPr>
+        <w:t xml:space="preserve">En la ciudad de {{CIUDAD_FIRMA}}, República Dominicana, hoy día {{DIA_TEXTO}} del mes de {{MES_TEXTO}} del año {{AÑO_TEXTO}} ({{AÑO_NUMERO}}); por ante mí, {{TRATAMIENTO_NOTARIO}} {{NOMBRE_NOTARIO}}, de nacionalidad dominicana, mayor de edad, Abogado Notario Público de los del número del {{MUNICIPIO_NOTARIO}}, titular de la Cédula No. {{DOCUMENTO IDENTIDAD_NOTARIO}}, con </w:t>
+      </w:r>
+      <w:proofErr w:type="gramStart"/>
+      <w:r>
+        <w:rPr>
+          <w:sz w:val="22"/>
+          <w:szCs w:val="22"/>
+        </w:rPr>
+        <w:t>carnet</w:t>
+      </w:r>
+      <w:proofErr w:type="gramEnd"/>
+      <w:r>
+        <w:rPr>
+          <w:sz w:val="22"/>
+          <w:szCs w:val="22"/>
+        </w:rPr>
+        <w:t xml:space="preserve"> del Colegio de Notarios No. {{MATRICULA_NOTARIO}} y estudio profesional en {{DIRECCION O DOMICILIO_NOTARIO}};</w:t>
+      </w:r>
+    </w:p>
+    <w:p>
+      <w:pPr>
+        <w:spacing w:after="0" w:line="240" w:lineRule="auto"/>
         <w:jc w:val="both"/>
-      </w:pPr>
-      <w:r>
-        <w:pict w14:anchorId="1A7B0EA4">
-          <v:rect id="_x0000_i1108" style="width:0;height:1.5pt" o:hralign="center" o:hrstd="t" o:hr="t" fillcolor="#a0a0a0" stroked="f"/>
-        </w:pict>
-      </w:r>
-    </w:p>
-    <w:p>
-      <w:pPr>
+        <w:rPr>
+          <w:sz w:val="22"/>
+          <w:szCs w:val="22"/>
+        </w:rPr>
+      </w:pPr>
+    </w:p>
+    <w:p>
+      <w:pPr>
+        <w:spacing w:after="0" w:line="240" w:lineRule="auto"/>
+        <w:jc w:val="center"/>
+        <w:rPr>
+          <w:sz w:val="22"/>
+          <w:szCs w:val="22"/>
+        </w:rPr>
+      </w:pPr>
+      <w:r>
+        <w:rPr>
+          <w:sz w:val="22"/>
+          <w:szCs w:val="22"/>
+        </w:rPr>
+        <w:t>HA COMPARECIDO de manera libre y voluntaria:</w:t>
+      </w:r>
+    </w:p>
+    <w:p>
+      <w:pPr>
+        <w:spacing w:after="0" w:line="240" w:lineRule="auto"/>
         <w:jc w:val="both"/>
         <w:rPr>
-          <w:b/>
-          <w:bCs/>
-        </w:rPr>
-      </w:pPr>
-      <w:r>
-        <w:rPr>
-          <w:b/>
-          <w:bCs/>
-        </w:rPr>
-        <w:t>ACTO NÚMERO [_______</w:t>
-      </w:r>
-      <w:proofErr w:type="gramStart"/>
-      <w:r>
-        <w:rPr>
-          <w:b/>
-          <w:bCs/>
-        </w:rPr>
-        <w:t>].-</w:t>
-      </w:r>
-      <w:proofErr w:type="gramEnd"/>
-      <w:r>
-        <w:rPr>
-          <w:b/>
-          <w:bCs/>
-        </w:rPr>
-        <w:t xml:space="preserve"> (ACTO DE NOTORIEDAD DE EXISTENCIA DE ESTABLECIMIENTO COMERCIAL)</w:t>
-      </w:r>
-    </w:p>
-    <w:p>
-      <w:pPr>
+          <w:sz w:val="22"/>
+          <w:szCs w:val="22"/>
+        </w:rPr>
+      </w:pPr>
+    </w:p>
+    <w:p>
+      <w:pPr>
+        <w:spacing w:after="0" w:line="240" w:lineRule="auto"/>
         <w:jc w:val="both"/>
-      </w:pPr>
-      <w:r>
-        <w:t xml:space="preserve">En la ciudad de [Ciudad], República Dominicana, hoy día [Día] del mes de [Mes] del año 2026; por ante mí, </w:t>
-      </w:r>
-      <w:r>
-        <w:rPr>
-          <w:b/>
-          <w:bCs/>
-        </w:rPr>
-        <w:t>[NOMBRE DEL NOTARIO]</w:t>
-      </w:r>
-      <w:r>
-        <w:t xml:space="preserve">, dominicano, mayor de edad, Abogado Notario Público de los del número del [Distrito Nacional / Municipio], titular de la Cédula No. [Número], con </w:t>
-      </w:r>
-      <w:proofErr w:type="gramStart"/>
-      <w:r>
-        <w:t>carnet</w:t>
-      </w:r>
-      <w:proofErr w:type="gramEnd"/>
-      <w:r>
-        <w:t xml:space="preserve"> del Colegio de Notarios No. [Número] y estudio profesional en [Dirección]; </w:t>
-      </w:r>
-      <w:r>
-        <w:rPr>
-          <w:b/>
-          <w:bCs/>
-        </w:rPr>
-        <w:t>HA COMPARECIDO</w:t>
-      </w:r>
-      <w:r>
-        <w:t xml:space="preserve"> de manera libre y voluntaria el señor/a:</w:t>
-      </w:r>
-    </w:p>
-    <w:p>
-      <w:pPr>
+        <w:rPr>
+          <w:sz w:val="22"/>
+          <w:szCs w:val="22"/>
+        </w:rPr>
+      </w:pPr>
+      <w:r>
+        <w:rPr>
+          <w:sz w:val="22"/>
+          <w:szCs w:val="22"/>
+        </w:rPr>
+        <w:t>{{TRATAMIENTO_DECLARANTE}} {{NOMBRE_DECLARANTE}}, de nacionalidad {{NACIONALIDAD_DECLARANTE}}, mayor de edad, titular de {{DOCUMENTO IDENTIDAD_DECLARANTE}}, actuando en nombre y representación de la entidad comercial {{NOMBRE_SOCIEDAD}}, con RNC No. {{DOCUMENTO IDENTIDAD_SOCIEDAD}}, con domicilio social en {{DIRECCION O DOMICILIO_SOCIEDAD}}, quien para los fines del presente acto se denominará EL DECLARANTE.</w:t>
+      </w:r>
+    </w:p>
+    <w:p>
+      <w:pPr>
+        <w:spacing w:after="0" w:line="240" w:lineRule="auto"/>
         <w:jc w:val="both"/>
-      </w:pPr>
-      <w:r>
-        <w:rPr>
-          <w:b/>
-          <w:bCs/>
-        </w:rPr>
-        <w:t>[NOMBRE DEL PROPIETARIO/GERENTE]</w:t>
-      </w:r>
-      <w:r>
-        <w:t xml:space="preserve">, dominicano, mayor de edad, titular de la Cédula No. [Número], actuando en nombre y representación de la entidad comercial </w:t>
-      </w:r>
-      <w:r>
-        <w:rPr>
-          <w:b/>
-          <w:bCs/>
-        </w:rPr>
-        <w:t>[NOMBRE DEL NEGOCIO O RAZÓN SOCIAL]</w:t>
-      </w:r>
-      <w:r>
-        <w:t xml:space="preserve">, [Si tiene RNC colocarlo], con domicilio social en [Dirección], quien para los fines del presente acto se denominará </w:t>
-      </w:r>
-      <w:r>
-        <w:rPr>
-          <w:b/>
-          <w:bCs/>
+        <w:rPr>
+          <w:sz w:val="22"/>
+          <w:szCs w:val="22"/>
+        </w:rPr>
+      </w:pPr>
+    </w:p>
+    <w:p>
+      <w:pPr>
+        <w:spacing w:after="0" w:line="240" w:lineRule="auto"/>
+        <w:jc w:val="both"/>
+        <w:rPr>
+          <w:sz w:val="22"/>
+          <w:szCs w:val="22"/>
+        </w:rPr>
+      </w:pPr>
+      <w:r>
+        <w:rPr>
+          <w:sz w:val="22"/>
+          <w:szCs w:val="22"/>
+        </w:rPr>
+        <w:t>Asimismo, comparecen los señores (Testigos):</w:t>
+      </w:r>
+    </w:p>
+    <w:p>
+      <w:pPr>
+        <w:spacing w:after="0" w:line="240" w:lineRule="auto"/>
+        <w:jc w:val="both"/>
+        <w:rPr>
+          <w:sz w:val="22"/>
+          <w:szCs w:val="22"/>
+        </w:rPr>
+      </w:pPr>
+      <w:r>
+        <w:rPr>
+          <w:sz w:val="22"/>
+          <w:szCs w:val="22"/>
+        </w:rPr>
+        <w:t>{{TRATAMIENTO_TESTIGO 1}} {{NOMBRE_TESTIGO 1}}, titular de {{DOCUMENTO IDENTIDAD_TESTIGO 1}}, domiciliado en {{DIRECCION O DOMICILIO_TESTIGO 1}}.</w:t>
+      </w:r>
+    </w:p>
+    <w:p>
+      <w:pPr>
+        <w:spacing w:after="0" w:line="240" w:lineRule="auto"/>
+        <w:jc w:val="both"/>
+        <w:rPr>
+          <w:sz w:val="22"/>
+          <w:szCs w:val="22"/>
+        </w:rPr>
+      </w:pPr>
+      <w:r>
+        <w:rPr>
+          <w:sz w:val="22"/>
+          <w:szCs w:val="22"/>
+        </w:rPr>
+        <w:t>{{TRATAMIENTO_TESTIGO 2}} {{NOMBRE_TESTIGO 2}}, titular de {{DOCUMENTO IDENTIDAD_TESTIGO 2}}, domiciliado en {{DIRECCION O DOMICILIO_TESTIGO 2}}.</w:t>
+      </w:r>
+    </w:p>
+    <w:p>
+      <w:pPr>
+        <w:spacing w:after="0" w:line="240" w:lineRule="auto"/>
+        <w:jc w:val="both"/>
+        <w:rPr>
+          <w:sz w:val="22"/>
+          <w:szCs w:val="22"/>
+        </w:rPr>
+      </w:pPr>
+      <w:r>
+        <w:rPr>
+          <w:sz w:val="22"/>
+          <w:szCs w:val="22"/>
+        </w:rPr>
+        <w:t>{{TRATAMIENTO_TESTIGO 3}} {{NOMBRE_TESTIGO 3}}, titular de {{DOCUMENTO IDENTIDAD_TESTIGO 3}}, domiciliado en {{DIRECCION O DOMICILIO_TESTIGO 3}}.</w:t>
+      </w:r>
+    </w:p>
+    <w:p>
+      <w:pPr>
+        <w:spacing w:after="0" w:line="240" w:lineRule="auto"/>
+        <w:jc w:val="both"/>
+        <w:rPr>
+          <w:sz w:val="22"/>
+          <w:szCs w:val="22"/>
+        </w:rPr>
+      </w:pPr>
+    </w:p>
+    <w:p>
+      <w:pPr>
+        <w:spacing w:after="0" w:line="240" w:lineRule="auto"/>
+        <w:jc w:val="both"/>
+        <w:rPr>
+          <w:sz w:val="22"/>
+          <w:szCs w:val="22"/>
+        </w:rPr>
+      </w:pPr>
+      <w:r>
+        <w:rPr>
+          <w:sz w:val="22"/>
+          <w:szCs w:val="22"/>
+        </w:rPr>
+        <w:t>LOS COMPARECIENTES, previa declaración jurada de decir la verdad, me han manifestado de manera unánime lo siguiente:</w:t>
+      </w:r>
+    </w:p>
+    <w:p>
+      <w:pPr>
+        <w:spacing w:after="0" w:line="240" w:lineRule="auto"/>
+        <w:jc w:val="both"/>
+        <w:rPr>
+          <w:sz w:val="22"/>
+          <w:szCs w:val="22"/>
+        </w:rPr>
+      </w:pPr>
+    </w:p>
+    <w:p>
+      <w:pPr>
+        <w:spacing w:after="0" w:line="240" w:lineRule="auto"/>
+        <w:jc w:val="center"/>
+        <w:rPr>
+          <w:sz w:val="22"/>
+          <w:szCs w:val="22"/>
+        </w:rPr>
+      </w:pPr>
+      <w:r>
+        <w:rPr>
+          <w:sz w:val="22"/>
+          <w:szCs w:val="22"/>
+        </w:rPr>
+        <w:t>CLÁUSULAS</w:t>
+      </w:r>
+    </w:p>
+    <w:p>
+      <w:pPr>
+        <w:spacing w:after="0" w:line="240" w:lineRule="auto"/>
+        <w:jc w:val="both"/>
+        <w:rPr>
+          <w:sz w:val="22"/>
+          <w:szCs w:val="22"/>
+        </w:rPr>
+      </w:pPr>
+    </w:p>
+    <w:p>
+      <w:pPr>
+        <w:spacing w:after="0" w:line="240" w:lineRule="auto"/>
+        <w:jc w:val="both"/>
+        <w:rPr>
+          <w:sz w:val="22"/>
+          <w:szCs w:val="22"/>
+        </w:rPr>
+      </w:pPr>
+      <w:r>
+        <w:rPr>
+          <w:sz w:val="22"/>
+          <w:szCs w:val="22"/>
+        </w:rPr>
+        <w:t>PRIMERA: DECLARACIÓN DE EXISTENCIA. EL DECLARANTE manifiesta bajo la fe del juramento que el negocio denominado {{NOMBRE_PUNTO_COMERCIAL}}, dedicado a la actividad de {{ACTIVIDAD_COMERCIAL}}, se encuentra operando de manera real, física y efectiva en el local ubicado en {{DIRECCION_PUNTO_COMERCIAL}}.</w:t>
+      </w:r>
+    </w:p>
+    <w:p>
+      <w:pPr>
+        <w:spacing w:after="0" w:line="240" w:lineRule="auto"/>
+        <w:jc w:val="both"/>
+        <w:rPr>
+          <w:sz w:val="22"/>
+          <w:szCs w:val="22"/>
+        </w:rPr>
+      </w:pPr>
+    </w:p>
+    <w:p>
+      <w:pPr>
+        <w:spacing w:after="0" w:line="240" w:lineRule="auto"/>
+        <w:jc w:val="both"/>
+        <w:rPr>
+          <w:sz w:val="22"/>
+          <w:szCs w:val="22"/>
+        </w:rPr>
+      </w:pPr>
+      <w:r>
+        <w:rPr>
+          <w:sz w:val="22"/>
+          <w:szCs w:val="22"/>
+        </w:rPr>
+        <w:t>SEGUNDA: TESTIMONIO DE NOTORIEDAD. Los testigos comparecientes declaran, por ser de pública notoriedad en el sector y por el trato comercial que mantienen con el negocio, que les consta de manera personal que dicho establecimiento ha funcionado de forma ininterrumpida y pública en la referida dirección desde hace aproximadamente {{TIEMPO_OPERACION_NEGOCIO}}.</w:t>
+      </w:r>
+    </w:p>
+    <w:p>
+      <w:pPr>
+        <w:spacing w:after="0" w:line="240" w:lineRule="auto"/>
+        <w:jc w:val="both"/>
+        <w:rPr>
+          <w:sz w:val="22"/>
+          <w:szCs w:val="22"/>
+        </w:rPr>
+      </w:pPr>
+    </w:p>
+    <w:p>
+      <w:pPr>
+        <w:spacing w:after="0" w:line="240" w:lineRule="auto"/>
+        <w:jc w:val="both"/>
+        <w:rPr>
+          <w:sz w:val="22"/>
+          <w:szCs w:val="22"/>
+        </w:rPr>
+      </w:pPr>
+      <w:r>
+        <w:rPr>
+          <w:sz w:val="22"/>
+          <w:szCs w:val="22"/>
+        </w:rPr>
+        <w:t>TERCERA: OBJETO DEL ACTO. El compareciente manifiesta que el presente acto se instrumenta con el fin de acreditar la existencia y operatividad del negocio ante {{INSTITUCION_DIRIGIDA}}, para los fines de {{TRAMITE_SOLICITADO}}, fundamentado en la Ley No. 140-15 del Notariado.</w:t>
+      </w:r>
+    </w:p>
+    <w:p>
+      <w:pPr>
+        <w:spacing w:after="0" w:line="240" w:lineRule="auto"/>
+        <w:jc w:val="both"/>
+        <w:rPr>
+          <w:sz w:val="22"/>
+          <w:szCs w:val="22"/>
+        </w:rPr>
+      </w:pPr>
+    </w:p>
+    <w:p>
+      <w:pPr>
+        <w:spacing w:after="0" w:line="240" w:lineRule="auto"/>
+        <w:jc w:val="both"/>
+        <w:rPr>
+          <w:sz w:val="22"/>
+          <w:szCs w:val="22"/>
+        </w:rPr>
+      </w:pPr>
+      <w:r>
+        <w:rPr>
+          <w:sz w:val="22"/>
+          <w:szCs w:val="22"/>
+        </w:rPr>
+        <w:t>CUARTA: CUMPLIMIENTO LEY 155-17. Los comparecientes declaran que las actividades comerciales realizadas en dicho establecimiento tienen un origen lícito y se ajustan a las normativas vigentes de la República Dominicana, cumpliendo con la Ley contra el Lavado de Activos.</w:t>
+      </w:r>
+    </w:p>
+    <w:p>
+      <w:pPr>
+        <w:spacing w:after="0" w:line="240" w:lineRule="auto"/>
+        <w:jc w:val="both"/>
+        <w:rPr>
+          <w:sz w:val="22"/>
+          <w:szCs w:val="22"/>
+        </w:rPr>
+      </w:pPr>
+    </w:p>
+    <w:p>
+      <w:pPr>
+        <w:spacing w:after="0" w:line="240" w:lineRule="auto"/>
+        <w:jc w:val="both"/>
+        <w:rPr>
+          <w:sz w:val="22"/>
+          <w:szCs w:val="22"/>
+        </w:rPr>
+      </w:pPr>
+      <w:r>
+        <w:rPr>
+          <w:sz w:val="22"/>
+          <w:szCs w:val="22"/>
+        </w:rPr>
+        <w:t>QUINTA: PENALIDAD POR PERJURIO. Los testigos declaran estar conscientes de que el falso testimonio ante un Notario Público conlleva las penas establecidas en el Código Penal Dominicano.</w:t>
+      </w:r>
+    </w:p>
+    <w:p>
+      <w:pPr>
+        <w:spacing w:after="0" w:line="240" w:lineRule="auto"/>
+        <w:jc w:val="both"/>
+        <w:rPr>
+          <w:sz w:val="22"/>
+          <w:szCs w:val="22"/>
+        </w:rPr>
+      </w:pPr>
+    </w:p>
+    <w:p>
+      <w:pPr>
+        <w:spacing w:after="0" w:line="240" w:lineRule="auto"/>
+        <w:jc w:val="both"/>
+        <w:rPr>
+          <w:sz w:val="22"/>
+          <w:szCs w:val="22"/>
+        </w:rPr>
+      </w:pPr>
+      <w:r>
+        <w:rPr>
+          <w:sz w:val="22"/>
+          <w:szCs w:val="22"/>
+        </w:rPr>
+        <w:t>HECHO Y PASADO POR ANTE MÍ, en mi estudio profesional, el día y año antes indicados. He dado lectura íntegra a los comparecientes, quienes en señal de aprobación firman junto conmigo y ante mí, Notario Público que CERTIFICO Y DOY FE.</w:t>
+      </w:r>
+    </w:p>
+    <w:p>
+      <w:pPr>
+        <w:spacing w:after="0" w:line="240" w:lineRule="auto"/>
+        <w:jc w:val="center"/>
+        <w:rPr>
+          <w:sz w:val="22"/>
+          <w:szCs w:val="22"/>
+        </w:rPr>
+      </w:pPr>
+    </w:p>
+    <w:p>
+      <w:pPr>
+        <w:spacing w:after="0" w:line="240" w:lineRule="auto"/>
+        <w:jc w:val="center"/>
+        <w:rPr>
+          <w:sz w:val="22"/>
+          <w:szCs w:val="22"/>
+        </w:rPr>
+      </w:pPr>
+      <w:r>
+        <w:rPr>
+          <w:sz w:val="22"/>
+          <w:szCs w:val="22"/>
+        </w:rPr>
+        <w:t>{{NOMBRE_DECLARANTE}}</w:t>
+      </w:r>
+    </w:p>
+    <w:p>
+      <w:pPr>
+        <w:spacing w:after="0" w:line="240" w:lineRule="auto"/>
+        <w:jc w:val="center"/>
+        <w:rPr>
+          <w:sz w:val="22"/>
+          <w:szCs w:val="22"/>
+        </w:rPr>
+      </w:pPr>
+      <w:r>
+        <w:rPr>
+          <w:sz w:val="22"/>
+          <w:szCs w:val="22"/>
         </w:rPr>
         <w:t>EL DECLARANTE</w:t>
       </w:r>
-      <w:r>
-        <w:t>.</w:t>
-      </w:r>
-    </w:p>
-    <w:p>
-      <w:pPr>
-        <w:jc w:val="both"/>
-      </w:pPr>
-      <w:r>
-        <w:t>Asimismo, comparecen los señores (Testigos):</w:t>
-      </w:r>
-    </w:p>
-    <w:p>
-      <w:pPr>
-        <w:numPr>
-          <w:ilvl w:val="0"/>
-          <w:numId w:val="6"/>
-        </w:numPr>
-        <w:jc w:val="both"/>
-      </w:pPr>
-      <w:r>
-        <w:rPr>
-          <w:b/>
-          <w:bCs/>
-        </w:rPr>
-        <w:t>[TESTIGO 1]</w:t>
-      </w:r>
-      <w:r>
-        <w:t>, Cédula [Número], [Domicilio].</w:t>
-      </w:r>
-    </w:p>
-    <w:p>
-      <w:pPr>
-        <w:numPr>
-          <w:ilvl w:val="0"/>
-          <w:numId w:val="6"/>
-        </w:numPr>
-        <w:jc w:val="both"/>
-      </w:pPr>
-      <w:r>
-        <w:rPr>
-          <w:b/>
-          <w:bCs/>
-        </w:rPr>
-        <w:t>[TESTIGO 2]</w:t>
-      </w:r>
-      <w:r>
-        <w:t>, Cédula [Número], [Domicilio].</w:t>
-      </w:r>
-    </w:p>
-    <w:p>
-      <w:pPr>
-        <w:numPr>
-          <w:ilvl w:val="0"/>
-          <w:numId w:val="6"/>
-        </w:numPr>
-        <w:jc w:val="both"/>
-      </w:pPr>
-      <w:r>
-        <w:rPr>
-          <w:b/>
-          <w:bCs/>
-        </w:rPr>
-        <w:t>[TESTIGO 3]</w:t>
-      </w:r>
-      <w:r>
-        <w:t>, Cédula [Número], [Domicilio].</w:t>
-      </w:r>
-    </w:p>
-    <w:p>
-      <w:pPr>
-        <w:jc w:val="both"/>
-      </w:pPr>
-      <w:r>
-        <w:rPr>
-          <w:b/>
-          <w:bCs/>
-        </w:rPr>
-        <w:t>LOS COMPARECIENTES</w:t>
-      </w:r>
-      <w:r>
-        <w:t>, previa declaración jurada de decir la verdad, me han manifestado de manera unánime lo siguiente:</w:t>
-      </w:r>
-    </w:p>
-    <w:p>
-      <w:pPr>
-        <w:jc w:val="both"/>
-        <w:rPr>
-          <w:b/>
-          <w:bCs/>
-        </w:rPr>
-      </w:pPr>
-      <w:r>
-        <w:rPr>
-          <w:b/>
-          <w:bCs/>
-        </w:rPr>
-        <w:t>CLÁUSULAS</w:t>
-      </w:r>
-    </w:p>
-    <w:p>
-      <w:pPr>
-        <w:jc w:val="both"/>
-      </w:pPr>
-      <w:r>
-        <w:rPr>
-          <w:b/>
-          <w:bCs/>
-        </w:rPr>
-        <w:t>PRIMERA: DECLARACIÓN DE EXISTENCIA.</w:t>
-      </w:r>
-      <w:r>
+    </w:p>
+    <w:p>
+      <w:pPr>
+        <w:spacing w:after="0" w:line="240" w:lineRule="auto"/>
+        <w:jc w:val="center"/>
+        <w:rPr>
+          <w:sz w:val="22"/>
+          <w:szCs w:val="22"/>
+        </w:rPr>
+      </w:pPr>
+    </w:p>
+    <w:p>
+      <w:pPr>
+        <w:spacing w:after="0" w:line="240" w:lineRule="auto"/>
+        <w:jc w:val="center"/>
+        <w:rPr>
+          <w:sz w:val="22"/>
+          <w:szCs w:val="22"/>
+        </w:rPr>
+      </w:pPr>
+      <w:r>
+        <w:rPr>
+          <w:sz w:val="22"/>
+          <w:szCs w:val="22"/>
+        </w:rPr>
+        <w:t>{{NOMBRE_TESTIGO 1}} {{NOMBRE_TESTIGO 2}} {{NOMBRE_TESTIGO 3}}</w:t>
+      </w:r>
+    </w:p>
+    <w:p>
+      <w:pPr>
+        <w:spacing w:after="0" w:line="240" w:lineRule="auto"/>
+        <w:jc w:val="center"/>
+        <w:rPr>
+          <w:sz w:val="22"/>
+          <w:szCs w:val="22"/>
+        </w:rPr>
+      </w:pPr>
+      <w:r>
+        <w:rPr>
+          <w:sz w:val="22"/>
+          <w:szCs w:val="22"/>
+        </w:rPr>
+        <w:t xml:space="preserve">Testigo </w:t>
+      </w:r>
+      <w:proofErr w:type="spellStart"/>
+      <w:r>
+        <w:rPr>
+          <w:sz w:val="22"/>
+          <w:szCs w:val="22"/>
+        </w:rPr>
+        <w:t>Testigo</w:t>
+      </w:r>
+      <w:proofErr w:type="spellEnd"/>
+      <w:r>
+        <w:rPr>
+          <w:sz w:val="22"/>
+          <w:szCs w:val="22"/>
+        </w:rPr>
         <w:t xml:space="preserve"> </w:t>
       </w:r>
-      <w:r>
-        <w:rPr>
-          <w:b/>
-          <w:bCs/>
-        </w:rPr>
-        <w:t>EL DECLARANTE</w:t>
-      </w:r>
-      <w:r>
-        <w:t xml:space="preserve"> manifiesta bajo la fe del juramento que el negocio denominado </w:t>
-      </w:r>
-      <w:r>
-        <w:rPr>
-          <w:b/>
-          <w:bCs/>
-        </w:rPr>
-        <w:t>[NOMBRE COMERCIAL]</w:t>
-      </w:r>
-      <w:r>
-        <w:t>, dedicado a la actividad de [Describir giro: ej. Venta de repuestos / Cafetería / Centro de Copiado], se encuentra operando de manera real, física y efectiva en el local ubicado en [Dirección exacta, sector y ciudad].</w:t>
-      </w:r>
-    </w:p>
-    <w:p>
-      <w:pPr>
-        <w:jc w:val="both"/>
-      </w:pPr>
-      <w:r>
-        <w:rPr>
-          <w:b/>
-          <w:bCs/>
-        </w:rPr>
-        <w:t>SEGUNDA: TESTIMONIO DE NOTORIEDAD.</w:t>
-      </w:r>
-      <w:r>
-        <w:t xml:space="preserve"> Los testigos comparecientes declaran, por ser de pública notoriedad en el sector y por el trato comercial que </w:t>
-      </w:r>
-      <w:r>
-        <w:lastRenderedPageBreak/>
-        <w:t xml:space="preserve">mantienen con el negocio, que les consta de manera personal que dicho establecimiento ha funcionado de forma ininterrumpida y pública en la referida dirección desde hace aproximadamente </w:t>
-      </w:r>
-      <w:r>
-        <w:rPr>
-          <w:b/>
-          <w:bCs/>
-        </w:rPr>
-        <w:t>[Número de años/meses]</w:t>
-      </w:r>
-      <w:r>
-        <w:t>.</w:t>
-      </w:r>
-    </w:p>
-    <w:p>
-      <w:pPr>
-        <w:jc w:val="both"/>
-      </w:pPr>
-      <w:r>
-        <w:rPr>
-          <w:b/>
-          <w:bCs/>
-        </w:rPr>
-        <w:t>TERCERA: OBJETO DEL ACTO.</w:t>
-      </w:r>
-      <w:r>
-        <w:t xml:space="preserve"> El compareciente manifiesta que el presente acto se instrumenta con el fin de acreditar la existencia y operatividad del negocio ante [Institución: ej. Dirección General de Impuestos Internos (DGII) / Ayuntamiento / Ministerio de Salud Pública], para los fines de [Especificar trámite: ej. Obtención de RNC / Solicitud de Permiso de Uso de Suelo].</w:t>
-      </w:r>
-    </w:p>
-    <w:p>
-      <w:pPr>
-        <w:jc w:val="both"/>
-      </w:pPr>
-      <w:r>
-        <w:rPr>
-          <w:b/>
-          <w:bCs/>
-        </w:rPr>
-        <w:t>CUARTA: CUMPLIMIENTO LEY 155-17.</w:t>
-      </w:r>
-      <w:r>
-        <w:t xml:space="preserve"> Los comparecientes declaran que las actividades comerciales realizadas en dicho establecimiento tienen un origen lícito y se ajustan a las normativas vigentes de la República Dominicana, cumpliendo con la </w:t>
-      </w:r>
-      <w:r>
-        <w:rPr>
-          <w:b/>
-          <w:bCs/>
-        </w:rPr>
-        <w:t>Ley contra el Lavado de Activos</w:t>
-      </w:r>
-      <w:r>
-        <w:t>.</w:t>
-      </w:r>
-    </w:p>
-    <w:p>
-      <w:pPr>
-        <w:jc w:val="both"/>
-      </w:pPr>
-      <w:r>
-        <w:rPr>
-          <w:b/>
-          <w:bCs/>
-        </w:rPr>
-        <w:t>QUINTA: PENALIDAD POR PERJURIO.</w:t>
-      </w:r>
-      <w:r>
-        <w:t xml:space="preserve"> Los testigos declaran estar conscientes de que el falso testimonio ante un Notario Público conlleva las penas establecidas en el Código Penal Dominicano.</w:t>
-      </w:r>
-    </w:p>
-    <w:p>
-      <w:pPr>
-        <w:jc w:val="both"/>
-      </w:pPr>
-      <w:r>
-        <w:pict w14:anchorId="7DED6CB6">
-          <v:rect id="_x0000_i1109" style="width:0;height:1.5pt" o:hralign="center" o:hrstd="t" o:hr="t" fillcolor="#a0a0a0" stroked="f"/>
-        </w:pict>
-      </w:r>
-    </w:p>
-    <w:p>
-      <w:pPr>
-        <w:jc w:val="both"/>
-      </w:pPr>
-      <w:r>
-        <w:rPr>
-          <w:b/>
-          <w:bCs/>
-        </w:rPr>
-        <w:t>HECHO Y PASADO POR ANTE MÍ</w:t>
-      </w:r>
-      <w:r>
-        <w:t>, en mi estudio profesional, el día y año antes indicados. He dado lectura íntegra a los comparecientes, quienes en señal de aprobación firman junto conmigo y ante mí, Notario Público que CERTIFICO Y DOY FE.</w:t>
-      </w:r>
-    </w:p>
-    <w:p>
-      <w:pPr>
-        <w:jc w:val="both"/>
-      </w:pPr>
+      <w:proofErr w:type="spellStart"/>
+      <w:r>
+        <w:rPr>
+          <w:sz w:val="22"/>
+          <w:szCs w:val="22"/>
+        </w:rPr>
+        <w:t>Testigo</w:t>
+      </w:r>
+      <w:proofErr w:type="spellEnd"/>
+    </w:p>
+    <w:p>
+      <w:pPr>
+        <w:spacing w:after="0" w:line="240" w:lineRule="auto"/>
+        <w:jc w:val="center"/>
+        <w:rPr>
+          <w:sz w:val="22"/>
+          <w:szCs w:val="22"/>
+        </w:rPr>
+      </w:pPr>
+    </w:p>
+    <w:p>
+      <w:pPr>
+        <w:spacing w:after="0" w:line="240" w:lineRule="auto"/>
+        <w:jc w:val="center"/>
+        <w:rPr>
+          <w:sz w:val="22"/>
+          <w:szCs w:val="22"/>
+        </w:rPr>
+      </w:pPr>
+      <w:r>
+        <w:rPr>
+          <w:sz w:val="22"/>
+          <w:szCs w:val="22"/>
+        </w:rPr>
+        <w:t>{{NOMBRE_NOTARIO}}</w:t>
+      </w:r>
+    </w:p>
+    <w:p>
+      <w:pPr>
+        <w:spacing w:after="0" w:line="240" w:lineRule="auto"/>
+        <w:jc w:val="center"/>
+        <w:rPr>
+          <w:sz w:val="22"/>
+          <w:szCs w:val="22"/>
+        </w:rPr>
+      </w:pPr>
+      <w:r>
+        <w:rPr>
+          <w:sz w:val="22"/>
+          <w:szCs w:val="22"/>
+        </w:rPr>
+        <w:t>Notario Público</w:t>
+      </w:r>
     </w:p>
     <w:sectPr>
       <w:pgSz w:w="11906" w:h="16838"/>

</xml_diff>